<commit_message>
Ajuste CFA - Vinculacion
</commit_message>
<xml_diff>
--- a/fuentes/CF2_96151139_DU.docx
+++ b/fuentes/CF2_96151139_DU.docx
@@ -3508,14 +3508,7 @@
         <w:rPr>
           <w:lang w:val="es-419" w:eastAsia="es-CO"/>
         </w:rPr>
-        <w:t>La estabilidad microbiológica de las carnes secas está directamente relacionada con su actividad de agua (</w:t>
-      </w:r>
-      <w:proofErr w:type="spellStart"/>
-      <w:r>
-        <w:rPr>
-          <w:lang w:val="es-419" w:eastAsia="es-CO"/>
-        </w:rPr>
-        <w:t>a</w:t>
+        <w:t>La estabilidad microbiológica de las carnes secas está directamente relacionada con su actividad de agua (a</w:t>
       </w:r>
       <w:r>
         <w:rPr>
@@ -3523,7 +3516,6 @@
         </w:rPr>
         <w:t>w</w:t>
       </w:r>
-      <w:proofErr w:type="spellEnd"/>
       <w:r>
         <w:rPr>
           <w:lang w:val="es-419" w:eastAsia="es-CO"/>
@@ -6879,18 +6871,7 @@
           <w:lang w:eastAsia="es-CO"/>
           <w14:ligatures w14:val="none"/>
         </w:rPr>
-        <w:t xml:space="preserve"> artesanales. SCRIBD</w:t>
-      </w:r>
-      <w:r>
-        <w:rPr>
-          <w:rFonts w:eastAsia="Times New Roman" w:cstheme="minorHAnsi"/>
-          <w:kern w:val="0"/>
-          <w:szCs w:val="28"/>
-          <w:bdr w:val="none" w:sz="0" w:space="0" w:color="auto" w:frame="1"/>
-          <w:lang w:eastAsia="es-CO"/>
-          <w14:ligatures w14:val="none"/>
-        </w:rPr>
-        <w:t>.</w:t>
+        <w:t xml:space="preserve"> artesanales. SCRIBD.</w:t>
       </w:r>
       <w:r>
         <w:rPr>
@@ -6926,7 +6907,7 @@
           <w:lang w:eastAsia="es-CO"/>
           <w14:ligatures w14:val="none"/>
         </w:rPr>
-        <w:t xml:space="preserve">  </w:t>
+        <w:t xml:space="preserve"> </w:t>
       </w:r>
     </w:p>
     <w:p>
@@ -6976,10 +6957,13 @@
           <w:lang w:eastAsia="es-CO"/>
           <w14:ligatures w14:val="none"/>
         </w:rPr>
-        <w:t xml:space="preserve">Mosquera, A. (s f.). Unidad 3 </w:t>
-      </w:r>
-      <w:proofErr w:type="spellStart"/>
-      <w:r>
+        <w:t>Onega, M. (2003). Evaluación de la calidad fresca: Aplicación de técnicas analíticas, instrumentales y sensoriales. Madrid, España: Universidad Complutense de Madrid.</w:t>
+      </w:r>
+    </w:p>
+    <w:p>
+      <w:pPr>
+        <w:spacing w:before="0" w:after="160" w:line="259" w:lineRule="auto"/>
+        <w:ind w:left="709" w:hanging="709"/>
         <w:rPr>
           <w:rFonts w:eastAsia="Times New Roman" w:cstheme="minorHAnsi"/>
           <w:kern w:val="0"/>
@@ -6988,9 +6972,7 @@
           <w:lang w:eastAsia="es-CO"/>
           <w14:ligatures w14:val="none"/>
         </w:rPr>
-        <w:t>carnicos</w:t>
-      </w:r>
-      <w:proofErr w:type="spellEnd"/>
+      </w:pPr>
       <w:r>
         <w:rPr>
           <w:rFonts w:eastAsia="Times New Roman" w:cstheme="minorHAnsi"/>
@@ -7000,7 +6982,7 @@
           <w:lang w:eastAsia="es-CO"/>
           <w14:ligatures w14:val="none"/>
         </w:rPr>
-        <w:t>. Scribd.</w:t>
+        <w:t>Páez Perilla, Á. V., &amp; Bobadilla Gutiérrez, P. A. (2014). Unidad 2. Productos e ingredientes cárnicos. Servicio Nacional de Aprendizaje – SENA, Centro Agroindustrial, Regional Quindío.</w:t>
       </w:r>
       <w:r>
         <w:rPr>
@@ -7024,7 +7006,7 @@
             <w:lang w:eastAsia="es-CO"/>
             <w14:ligatures w14:val="none"/>
           </w:rPr>
-          <w:t>https://es.scribd.com/document/425610108/UNIDAD-3-CARNICOS</w:t>
+          <w:t>https://ecoredsena-santander.github.io/96151139_CF2_CONTROL_CALIDAD_PRODUCTOS_CARNICOS/downloads/Control_calidad_productos_carnicos.pdf</w:t>
         </w:r>
       </w:hyperlink>
       <w:r>
@@ -7036,7 +7018,7 @@
           <w:lang w:eastAsia="es-CO"/>
           <w14:ligatures w14:val="none"/>
         </w:rPr>
-        <w:t xml:space="preserve">  </w:t>
+        <w:t xml:space="preserve"> </w:t>
       </w:r>
     </w:p>
     <w:p>
@@ -7061,13 +7043,10 @@
           <w:lang w:eastAsia="es-CO"/>
           <w14:ligatures w14:val="none"/>
         </w:rPr>
-        <w:t>Onega, M. (2003). Evaluación de la calidad fresca: Aplicación de técnicas analíticas, instrumentales y sensoriales. Madrid, España: Universidad Complutense de Madrid.</w:t>
-      </w:r>
-    </w:p>
-    <w:p>
-      <w:pPr>
-        <w:spacing w:before="0" w:after="160" w:line="259" w:lineRule="auto"/>
-        <w:ind w:left="709" w:hanging="709"/>
+        <w:t xml:space="preserve">Restrepo Molina, D.A., Arango Mejía, C.M., Amézquita Campuzano, A., Restrepo </w:t>
+      </w:r>
+      <w:proofErr w:type="spellStart"/>
+      <w:r>
         <w:rPr>
           <w:rFonts w:eastAsia="Times New Roman" w:cstheme="minorHAnsi"/>
           <w:kern w:val="0"/>
@@ -7076,7 +7055,9 @@
           <w:lang w:eastAsia="es-CO"/>
           <w14:ligatures w14:val="none"/>
         </w:rPr>
-      </w:pPr>
+        <w:t>Digiammarco</w:t>
+      </w:r>
+      <w:proofErr w:type="spellEnd"/>
       <w:r>
         <w:rPr>
           <w:rFonts w:eastAsia="Times New Roman" w:cstheme="minorHAnsi"/>
@@ -7086,42 +7067,7 @@
           <w:lang w:eastAsia="es-CO"/>
           <w14:ligatures w14:val="none"/>
         </w:rPr>
-        <w:t xml:space="preserve">Restrepo Molina, D.A., Arango Mejía, C.M., Amézquita Campuzano, A., Restrepo </w:t>
-      </w:r>
-      <w:proofErr w:type="spellStart"/>
-      <w:r>
-        <w:rPr>
-          <w:rFonts w:eastAsia="Times New Roman" w:cstheme="minorHAnsi"/>
-          <w:kern w:val="0"/>
-          <w:szCs w:val="28"/>
-          <w:bdr w:val="none" w:sz="0" w:space="0" w:color="auto" w:frame="1"/>
-          <w:lang w:eastAsia="es-CO"/>
-          <w14:ligatures w14:val="none"/>
-        </w:rPr>
-        <w:t>Digiammarco</w:t>
-      </w:r>
-      <w:proofErr w:type="spellEnd"/>
-      <w:r>
-        <w:rPr>
-          <w:rFonts w:eastAsia="Times New Roman" w:cstheme="minorHAnsi"/>
-          <w:kern w:val="0"/>
-          <w:szCs w:val="28"/>
-          <w:bdr w:val="none" w:sz="0" w:space="0" w:color="auto" w:frame="1"/>
-          <w:lang w:eastAsia="es-CO"/>
-          <w14:ligatures w14:val="none"/>
-        </w:rPr>
-        <w:t>, R.A. (2001). Industria de carnes. Universidad Nacional de Colombia. Medellín, Colombia</w:t>
-      </w:r>
-      <w:r>
-        <w:rPr>
-          <w:rFonts w:eastAsia="Times New Roman" w:cstheme="minorHAnsi"/>
-          <w:kern w:val="0"/>
-          <w:szCs w:val="28"/>
-          <w:bdr w:val="none" w:sz="0" w:space="0" w:color="auto" w:frame="1"/>
-          <w:lang w:eastAsia="es-CO"/>
-          <w14:ligatures w14:val="none"/>
-        </w:rPr>
-        <w:t>.</w:t>
+        <w:t>, R.A. (2001). Industria de carnes. Universidad Nacional de Colombia. Medellín, Colombia.</w:t>
       </w:r>
       <w:r>
         <w:rPr>
@@ -7375,7 +7321,13 @@
               <w:pStyle w:val="TextoTablas"/>
             </w:pPr>
             <w:r>
-              <w:t>Centro Agroindustrial – Regional Quindío</w:t>
+              <w:t xml:space="preserve">Centro Agroindustrial </w:t>
+            </w:r>
+            <w:r>
+              <w:t>-</w:t>
+            </w:r>
+            <w:r>
+              <w:t xml:space="preserve"> Regional Quindío</w:t>
             </w:r>
           </w:p>
         </w:tc>
@@ -7419,7 +7371,13 @@
               <w:pStyle w:val="TextoTablas"/>
             </w:pPr>
             <w:r>
-              <w:t>Centro Agroindustrial – Regional Quindío</w:t>
+              <w:t xml:space="preserve">Centro Agroindustrial </w:t>
+            </w:r>
+            <w:r>
+              <w:t>-</w:t>
+            </w:r>
+            <w:r>
+              <w:t xml:space="preserve"> Regional Quindío</w:t>
             </w:r>
           </w:p>
         </w:tc>
@@ -11727,8 +11685,8 @@
 <file path=customXml/item1.xml><?xml version="1.0" encoding="utf-8"?>
 <p:properties xmlns:p="http://schemas.microsoft.com/office/2006/metadata/properties" xmlns:xsi="http://www.w3.org/2001/XMLSchema-instance" xmlns:pc="http://schemas.microsoft.com/office/infopath/2007/PartnerControls">
   <documentManagement>
-    <TaxCatchAll xmlns="cb45339b-ced9-4d0d-8f64-77573914d53b" xsi:nil="true"/>
-    <lcf76f155ced4ddcb4097134ff3c332f xmlns="43a3ca16-9c26-4813-b83f-4aec9927b43f">
+    <TaxCatchAll xmlns="285d351f-f218-493a-825f-85a9dfbde315" xsi:nil="true"/>
+    <lcf76f155ced4ddcb4097134ff3c332f xmlns="55abea07-cd72-4a95-add0-1082a24cf9e9">
       <Terms xmlns="http://schemas.microsoft.com/office/infopath/2007/PartnerControls"/>
     </lcf76f155ced4ddcb4097134ff3c332f>
   </documentManagement>
@@ -11749,30 +11707,26 @@
 </file>
 
 <file path=customXml/item4.xml><?xml version="1.0" encoding="utf-8"?>
-<ct:contentTypeSchema xmlns:ct="http://schemas.microsoft.com/office/2006/metadata/contentType" xmlns:ma="http://schemas.microsoft.com/office/2006/metadata/properties/metaAttributes" ct:_="" ma:_="" ma:contentTypeName="Documento" ma:contentTypeID="0x01010049282E1EDBE9234EA9E6D38F720E265F" ma:contentTypeVersion="15" ma:contentTypeDescription="Crear nuevo documento." ma:contentTypeScope="" ma:versionID="b31c7aa9eaf043a08b87120b3c4916e3">
-  <xsd:schema xmlns:xsd="http://www.w3.org/2001/XMLSchema" xmlns:xs="http://www.w3.org/2001/XMLSchema" xmlns:p="http://schemas.microsoft.com/office/2006/metadata/properties" xmlns:ns2="cb45339b-ced9-4d0d-8f64-77573914d53b" xmlns:ns3="43a3ca16-9c26-4813-b83f-4aec9927b43f" targetNamespace="http://schemas.microsoft.com/office/2006/metadata/properties" ma:root="true" ma:fieldsID="3533d065b04d75c457075bc55f1f5315" ns2:_="" ns3:_="">
-    <xsd:import namespace="cb45339b-ced9-4d0d-8f64-77573914d53b"/>
-    <xsd:import namespace="43a3ca16-9c26-4813-b83f-4aec9927b43f"/>
+<ct:contentTypeSchema xmlns:ct="http://schemas.microsoft.com/office/2006/metadata/contentType" xmlns:ma="http://schemas.microsoft.com/office/2006/metadata/properties/metaAttributes" ct:_="" ma:_="" ma:contentTypeName="Documento" ma:contentTypeID="0x0101005D7421CBAB376F47AC1876466873BE0C" ma:contentTypeVersion="11" ma:contentTypeDescription="Crear nuevo documento." ma:contentTypeScope="" ma:versionID="2b4f891a1a5ad88e3e621500c8553ae4">
+  <xsd:schema xmlns:xsd="http://www.w3.org/2001/XMLSchema" xmlns:xs="http://www.w3.org/2001/XMLSchema" xmlns:p="http://schemas.microsoft.com/office/2006/metadata/properties" xmlns:ns2="55abea07-cd72-4a95-add0-1082a24cf9e9" xmlns:ns3="285d351f-f218-493a-825f-85a9dfbde315" targetNamespace="http://schemas.microsoft.com/office/2006/metadata/properties" ma:root="true" ma:fieldsID="4883b2e7c543eac85f1b7e21127c6f20" ns2:_="" ns3:_="">
+    <xsd:import namespace="55abea07-cd72-4a95-add0-1082a24cf9e9"/>
+    <xsd:import namespace="285d351f-f218-493a-825f-85a9dfbde315"/>
     <xsd:element name="properties">
       <xsd:complexType>
         <xsd:sequence>
           <xsd:element name="documentManagement">
             <xsd:complexType>
               <xsd:all>
-                <xsd:element ref="ns2:SharedWithUsers" minOccurs="0"/>
-                <xsd:element ref="ns2:SharedWithDetails" minOccurs="0"/>
-                <xsd:element ref="ns3:MediaServiceMetadata" minOccurs="0"/>
-                <xsd:element ref="ns3:MediaServiceFastMetadata" minOccurs="0"/>
-                <xsd:element ref="ns3:MediaServiceDateTaken" minOccurs="0"/>
-                <xsd:element ref="ns3:MediaServiceObjectDetectorVersions" minOccurs="0"/>
-                <xsd:element ref="ns3:MediaLengthInSeconds" minOccurs="0"/>
-                <xsd:element ref="ns3:MediaServiceLocation" minOccurs="0"/>
-                <xsd:element ref="ns3:MediaServiceGenerationTime" minOccurs="0"/>
-                <xsd:element ref="ns3:MediaServiceEventHashCode" minOccurs="0"/>
-                <xsd:element ref="ns3:lcf76f155ced4ddcb4097134ff3c332f" minOccurs="0"/>
-                <xsd:element ref="ns2:TaxCatchAll" minOccurs="0"/>
-                <xsd:element ref="ns3:MediaServiceOCR" minOccurs="0"/>
-                <xsd:element ref="ns3:MediaServiceSearchProperties" minOccurs="0"/>
+                <xsd:element ref="ns2:MediaServiceMetadata" minOccurs="0"/>
+                <xsd:element ref="ns2:MediaServiceFastMetadata" minOccurs="0"/>
+                <xsd:element ref="ns2:MediaServiceSearchProperties" minOccurs="0"/>
+                <xsd:element ref="ns2:MediaServiceDateTaken" minOccurs="0"/>
+                <xsd:element ref="ns2:lcf76f155ced4ddcb4097134ff3c332f" minOccurs="0"/>
+                <xsd:element ref="ns3:TaxCatchAll" minOccurs="0"/>
+                <xsd:element ref="ns2:MediaServiceOCR" minOccurs="0"/>
+                <xsd:element ref="ns2:MediaServiceGenerationTime" minOccurs="0"/>
+                <xsd:element ref="ns2:MediaServiceEventHashCode" minOccurs="0"/>
+                <xsd:element ref="ns2:MediaLengthInSeconds" minOccurs="0"/>
               </xsd:all>
             </xsd:complexType>
           </xsd:element>
@@ -11780,78 +11734,41 @@
       </xsd:complexType>
     </xsd:element>
   </xsd:schema>
-  <xsd:schema xmlns:xsd="http://www.w3.org/2001/XMLSchema" xmlns:xs="http://www.w3.org/2001/XMLSchema" xmlns:dms="http://schemas.microsoft.com/office/2006/documentManagement/types" xmlns:pc="http://schemas.microsoft.com/office/infopath/2007/PartnerControls" targetNamespace="cb45339b-ced9-4d0d-8f64-77573914d53b" elementFormDefault="qualified">
+  <xsd:schema xmlns:xsd="http://www.w3.org/2001/XMLSchema" xmlns:xs="http://www.w3.org/2001/XMLSchema" xmlns:dms="http://schemas.microsoft.com/office/2006/documentManagement/types" xmlns:pc="http://schemas.microsoft.com/office/infopath/2007/PartnerControls" targetNamespace="55abea07-cd72-4a95-add0-1082a24cf9e9" elementFormDefault="qualified">
     <xsd:import namespace="http://schemas.microsoft.com/office/2006/documentManagement/types"/>
     <xsd:import namespace="http://schemas.microsoft.com/office/infopath/2007/PartnerControls"/>
-    <xsd:element name="SharedWithUsers" ma:index="8" nillable="true" ma:displayName="Compartido con" ma:internalName="SharedWithUsers" ma:readOnly="true">
+    <xsd:element name="MediaServiceMetadata" ma:index="8" nillable="true" ma:displayName="MediaServiceMetadata" ma:hidden="true" ma:internalName="MediaServiceMetadata" ma:readOnly="true">
+      <xsd:simpleType>
+        <xsd:restriction base="dms:Note"/>
+      </xsd:simpleType>
+    </xsd:element>
+    <xsd:element name="MediaServiceFastMetadata" ma:index="9" nillable="true" ma:displayName="MediaServiceFastMetadata" ma:hidden="true" ma:internalName="MediaServiceFastMetadata" ma:readOnly="true">
+      <xsd:simpleType>
+        <xsd:restriction base="dms:Note"/>
+      </xsd:simpleType>
+    </xsd:element>
+    <xsd:element name="MediaServiceSearchProperties" ma:index="10" nillable="true" ma:displayName="MediaServiceSearchProperties" ma:hidden="true" ma:internalName="MediaServiceSearchProperties" ma:readOnly="true">
+      <xsd:simpleType>
+        <xsd:restriction base="dms:Note"/>
+      </xsd:simpleType>
+    </xsd:element>
+    <xsd:element name="MediaServiceDateTaken" ma:index="11" nillable="true" ma:displayName="MediaServiceDateTaken" ma:hidden="true" ma:indexed="true" ma:internalName="MediaServiceDateTaken" ma:readOnly="true">
+      <xsd:simpleType>
+        <xsd:restriction base="dms:Text"/>
+      </xsd:simpleType>
+    </xsd:element>
+    <xsd:element name="lcf76f155ced4ddcb4097134ff3c332f" ma:index="13" nillable="true" ma:taxonomy="true" ma:internalName="lcf76f155ced4ddcb4097134ff3c332f" ma:taxonomyFieldName="MediaServiceImageTags" ma:displayName="Etiquetas de imagen" ma:readOnly="false" ma:fieldId="{5cf76f15-5ced-4ddc-b409-7134ff3c332f}" ma:taxonomyMulti="true" ma:sspId="d33c8c81-5745-4931-bcc4-c2aeafe86780" ma:termSetId="09814cd3-568e-fe90-9814-8d621ff8fb84" ma:anchorId="fba54fb3-c3e1-fe81-a776-ca4b69148c4d" ma:open="true" ma:isKeyword="false">
       <xsd:complexType>
-        <xsd:complexContent>
-          <xsd:extension base="dms:UserMulti">
-            <xsd:sequence>
-              <xsd:element name="UserInfo" minOccurs="0" maxOccurs="unbounded">
-                <xsd:complexType>
-                  <xsd:sequence>
-                    <xsd:element name="DisplayName" type="xsd:string" minOccurs="0"/>
-                    <xsd:element name="AccountId" type="dms:UserId" minOccurs="0" nillable="true"/>
-                    <xsd:element name="AccountType" type="xsd:string" minOccurs="0"/>
-                  </xsd:sequence>
-                </xsd:complexType>
-              </xsd:element>
-            </xsd:sequence>
-          </xsd:extension>
-        </xsd:complexContent>
+        <xsd:sequence>
+          <xsd:element ref="pc:Terms" minOccurs="0" maxOccurs="1"/>
+        </xsd:sequence>
       </xsd:complexType>
     </xsd:element>
-    <xsd:element name="SharedWithDetails" ma:index="9" nillable="true" ma:displayName="Detalles de uso compartido" ma:internalName="SharedWithDetails" ma:readOnly="true">
+    <xsd:element name="MediaServiceOCR" ma:index="15" nillable="true" ma:displayName="Extracted Text" ma:internalName="MediaServiceOCR" ma:readOnly="true">
       <xsd:simpleType>
         <xsd:restriction base="dms:Note">
           <xsd:maxLength value="255"/>
         </xsd:restriction>
-      </xsd:simpleType>
-    </xsd:element>
-    <xsd:element name="TaxCatchAll" ma:index="20" nillable="true" ma:displayName="Taxonomy Catch All Column" ma:hidden="true" ma:list="{2f40a149-578b-41a1-8845-c88bc1831770}" ma:internalName="TaxCatchAll" ma:showField="CatchAllData" ma:web="cb45339b-ced9-4d0d-8f64-77573914d53b">
-      <xsd:complexType>
-        <xsd:complexContent>
-          <xsd:extension base="dms:MultiChoiceLookup">
-            <xsd:sequence>
-              <xsd:element name="Value" type="dms:Lookup" maxOccurs="unbounded" minOccurs="0" nillable="true"/>
-            </xsd:sequence>
-          </xsd:extension>
-        </xsd:complexContent>
-      </xsd:complexType>
-    </xsd:element>
-  </xsd:schema>
-  <xsd:schema xmlns:xsd="http://www.w3.org/2001/XMLSchema" xmlns:xs="http://www.w3.org/2001/XMLSchema" xmlns:dms="http://schemas.microsoft.com/office/2006/documentManagement/types" xmlns:pc="http://schemas.microsoft.com/office/infopath/2007/PartnerControls" targetNamespace="43a3ca16-9c26-4813-b83f-4aec9927b43f" elementFormDefault="qualified">
-    <xsd:import namespace="http://schemas.microsoft.com/office/2006/documentManagement/types"/>
-    <xsd:import namespace="http://schemas.microsoft.com/office/infopath/2007/PartnerControls"/>
-    <xsd:element name="MediaServiceMetadata" ma:index="10" nillable="true" ma:displayName="MediaServiceMetadata" ma:hidden="true" ma:internalName="MediaServiceMetadata" ma:readOnly="true">
-      <xsd:simpleType>
-        <xsd:restriction base="dms:Note"/>
-      </xsd:simpleType>
-    </xsd:element>
-    <xsd:element name="MediaServiceFastMetadata" ma:index="11" nillable="true" ma:displayName="MediaServiceFastMetadata" ma:hidden="true" ma:internalName="MediaServiceFastMetadata" ma:readOnly="true">
-      <xsd:simpleType>
-        <xsd:restriction base="dms:Note"/>
-      </xsd:simpleType>
-    </xsd:element>
-    <xsd:element name="MediaServiceDateTaken" ma:index="12" nillable="true" ma:displayName="MediaServiceDateTaken" ma:hidden="true" ma:indexed="true" ma:internalName="MediaServiceDateTaken" ma:readOnly="true">
-      <xsd:simpleType>
-        <xsd:restriction base="dms:Text"/>
-      </xsd:simpleType>
-    </xsd:element>
-    <xsd:element name="MediaServiceObjectDetectorVersions" ma:index="13" nillable="true" ma:displayName="MediaServiceObjectDetectorVersions" ma:hidden="true" ma:indexed="true" ma:internalName="MediaServiceObjectDetectorVersions" ma:readOnly="true">
-      <xsd:simpleType>
-        <xsd:restriction base="dms:Text"/>
-      </xsd:simpleType>
-    </xsd:element>
-    <xsd:element name="MediaLengthInSeconds" ma:index="14" nillable="true" ma:displayName="MediaLengthInSeconds" ma:hidden="true" ma:internalName="MediaLengthInSeconds" ma:readOnly="true">
-      <xsd:simpleType>
-        <xsd:restriction base="dms:Unknown"/>
-      </xsd:simpleType>
-    </xsd:element>
-    <xsd:element name="MediaServiceLocation" ma:index="15" nillable="true" ma:displayName="Location" ma:indexed="true" ma:internalName="MediaServiceLocation" ma:readOnly="true">
-      <xsd:simpleType>
-        <xsd:restriction base="dms:Text"/>
       </xsd:simpleType>
     </xsd:element>
     <xsd:element name="MediaServiceGenerationTime" ma:index="16" nillable="true" ma:displayName="MediaServiceGenerationTime" ma:hidden="true" ma:internalName="MediaServiceGenerationTime" ma:readOnly="true">
@@ -11864,24 +11781,25 @@
         <xsd:restriction base="dms:Text"/>
       </xsd:simpleType>
     </xsd:element>
-    <xsd:element name="lcf76f155ced4ddcb4097134ff3c332f" ma:index="19" nillable="true" ma:taxonomy="true" ma:internalName="lcf76f155ced4ddcb4097134ff3c332f" ma:taxonomyFieldName="MediaServiceImageTags" ma:displayName="Etiquetas de imagen" ma:readOnly="false" ma:fieldId="{5cf76f15-5ced-4ddc-b409-7134ff3c332f}" ma:taxonomyMulti="true" ma:sspId="d33c8c81-5745-4931-bcc4-c2aeafe86780" ma:termSetId="09814cd3-568e-fe90-9814-8d621ff8fb84" ma:anchorId="fba54fb3-c3e1-fe81-a776-ca4b69148c4d" ma:open="true" ma:isKeyword="false">
-      <xsd:complexType>
-        <xsd:sequence>
-          <xsd:element ref="pc:Terms" minOccurs="0" maxOccurs="1"/>
-        </xsd:sequence>
-      </xsd:complexType>
-    </xsd:element>
-    <xsd:element name="MediaServiceOCR" ma:index="21" nillable="true" ma:displayName="Extracted Text" ma:internalName="MediaServiceOCR" ma:readOnly="true">
+    <xsd:element name="MediaLengthInSeconds" ma:index="18" nillable="true" ma:displayName="MediaLengthInSeconds" ma:hidden="true" ma:internalName="MediaLengthInSeconds" ma:readOnly="true">
       <xsd:simpleType>
-        <xsd:restriction base="dms:Note">
-          <xsd:maxLength value="255"/>
-        </xsd:restriction>
+        <xsd:restriction base="dms:Unknown"/>
       </xsd:simpleType>
     </xsd:element>
-    <xsd:element name="MediaServiceSearchProperties" ma:index="22" nillable="true" ma:displayName="MediaServiceSearchProperties" ma:hidden="true" ma:internalName="MediaServiceSearchProperties" ma:readOnly="true">
-      <xsd:simpleType>
-        <xsd:restriction base="dms:Note"/>
-      </xsd:simpleType>
+  </xsd:schema>
+  <xsd:schema xmlns:xsd="http://www.w3.org/2001/XMLSchema" xmlns:xs="http://www.w3.org/2001/XMLSchema" xmlns:dms="http://schemas.microsoft.com/office/2006/documentManagement/types" xmlns:pc="http://schemas.microsoft.com/office/infopath/2007/PartnerControls" targetNamespace="285d351f-f218-493a-825f-85a9dfbde315" elementFormDefault="qualified">
+    <xsd:import namespace="http://schemas.microsoft.com/office/2006/documentManagement/types"/>
+    <xsd:import namespace="http://schemas.microsoft.com/office/infopath/2007/PartnerControls"/>
+    <xsd:element name="TaxCatchAll" ma:index="14" nillable="true" ma:displayName="Taxonomy Catch All Column" ma:hidden="true" ma:list="{5d57ac59-ec13-4ab6-8bf8-a162ea89df9b}" ma:internalName="TaxCatchAll" ma:showField="CatchAllData" ma:web="285d351f-f218-493a-825f-85a9dfbde315">
+      <xsd:complexType>
+        <xsd:complexContent>
+          <xsd:extension base="dms:MultiChoiceLookup">
+            <xsd:sequence>
+              <xsd:element name="Value" type="dms:Lookup" maxOccurs="unbounded" minOccurs="0" nillable="true"/>
+            </xsd:sequence>
+          </xsd:extension>
+        </xsd:complexContent>
+      </xsd:complexType>
     </xsd:element>
   </xsd:schema>
   <xsd:schema xmlns="http://schemas.openxmlformats.org/package/2006/metadata/core-properties" xmlns:xsd="http://www.w3.org/2001/XMLSchema" xmlns:xsi="http://www.w3.org/2001/XMLSchema-instance" xmlns:dc="http://purl.org/dc/elements/1.1/" xmlns:dcterms="http://purl.org/dc/terms/" xmlns:odoc="http://schemas.microsoft.com/internal/obd" targetNamespace="http://schemas.openxmlformats.org/package/2006/metadata/core-properties" elementFormDefault="qualified" attributeFormDefault="unqualified" blockDefault="#all">
@@ -12011,20 +11929,5 @@
 </file>
 
 <file path=customXml/itemProps4.xml><?xml version="1.0" encoding="utf-8"?>
-<ds:datastoreItem xmlns:ds="http://schemas.openxmlformats.org/officeDocument/2006/customXml" ds:itemID="{0BC4A0A4-89EA-4C0C-9011-C1B351E892BC}">
-  <ds:schemaRefs>
-    <ds:schemaRef ds:uri="http://schemas.microsoft.com/office/2006/metadata/contentType"/>
-    <ds:schemaRef ds:uri="http://schemas.microsoft.com/office/2006/metadata/properties/metaAttributes"/>
-    <ds:schemaRef ds:uri="http://www.w3.org/2001/XMLSchema"/>
-    <ds:schemaRef ds:uri="http://schemas.microsoft.com/office/2006/metadata/properties"/>
-    <ds:schemaRef ds:uri="cb45339b-ced9-4d0d-8f64-77573914d53b"/>
-    <ds:schemaRef ds:uri="43a3ca16-9c26-4813-b83f-4aec9927b43f"/>
-    <ds:schemaRef ds:uri="http://schemas.microsoft.com/office/2006/documentManagement/types"/>
-    <ds:schemaRef ds:uri="http://schemas.microsoft.com/office/infopath/2007/PartnerControls"/>
-    <ds:schemaRef ds:uri="http://schemas.openxmlformats.org/package/2006/metadata/core-properties"/>
-    <ds:schemaRef ds:uri="http://purl.org/dc/elements/1.1/"/>
-    <ds:schemaRef ds:uri="http://purl.org/dc/terms/"/>
-    <ds:schemaRef ds:uri="http://schemas.microsoft.com/internal/obd"/>
-  </ds:schemaRefs>
-</ds:datastoreItem>
+<ds:datastoreItem xmlns:ds="http://schemas.openxmlformats.org/officeDocument/2006/customXml" ds:itemID="{191DDCB9-ADCF-48E4-A856-FCAD09B0A3AD}"/>
 </file>
</xml_diff>